<commit_message>
docs(report): embed the nine Kubernetes evidence screenshots
Figures 1 to 9 in section 8.6 now carry the actual captures from the
minikube deployment: cluster node, all fifteen pods Running, station logs
with drops, central station batch persistence, both Kafka topics, and the
three PostgreSQL queries including the full thirty-row battery
distribution.

Images are scaled to the 6.5 inch text column and capped at 7 inches tall
so none of them splits across a page.

The nine placeholders in section 9.7 are deliberately left empty; they
need the AWS instances to exist first.
</commit_message>
<xml_diff>
--- a/Lab4_Weather_Monitoring_Report.docx
+++ b/Lab4_Weather_Monitoring_Report.docx
@@ -5579,32 +5579,105 @@
     </w:p>
     <w:p>
       <w:pPr>
-        <w:pBdr>
-          <w:top w:val="dashed" w:color="A6A6A6" w:sz="6"/>
-          <w:left w:val="dashed" w:color="A6A6A6" w:sz="6"/>
-          <w:bottom w:val="dashed" w:color="A6A6A6" w:sz="6"/>
-          <w:right w:val="dashed" w:color="A6A6A6" w:sz="6"/>
-        </w:pBdr>
-        <w:shd w:fill="FAFAFA" w:val="clear"/>
-        <w:spacing w:before="120" w:after="240"/>
+        <w:spacing w:before="60" w:after="240"/>
         <w:jc w:val="center"/>
       </w:pPr>
       <w:r>
-        <w:rPr>
-          <w:rFonts w:ascii="Calibri" w:cs="Calibri" w:eastAsia="Calibri" w:hAnsi="Calibri"/>
-          <w:i/>
-          <w:iCs/>
-          <w:color w:val="808080"/>
+        <w:drawing>
+          <wp:inline distT="0" distB="0" distL="0" distR="0">
+            <wp:extent cx="5943600" cy="863476"/>
+            <wp:effectExtent l="0" t="0" r="0" b="0"/>
+            <wp:docPr id="1001" name="Figure 1"/>
+            <wp:cNvGraphicFramePr>
+              <a:graphicFrameLocks xmlns:a="http://schemas.openxmlformats.org/drawingml/2006/main" noChangeAspect="1"/>
+            </wp:cNvGraphicFramePr>
+            <a:graphic xmlns:a="http://schemas.openxmlformats.org/drawingml/2006/main">
+              <a:graphicData uri="http://schemas.openxmlformats.org/drawingml/2006/picture">
+                <pic:pic xmlns:pic="http://schemas.openxmlformats.org/drawingml/2006/picture">
+                  <pic:nvPicPr>
+                    <pic:cNvPr id="1001" name="fig1.png"/>
+                    <pic:cNvPicPr/>
+                  </pic:nvPicPr>
+                  <pic:blipFill>
+                    <a:blip r:embed="rId100"/>
+                    <a:stretch>
+                      <a:fillRect/>
+                    </a:stretch>
+                  </pic:blipFill>
+                  <pic:spPr>
+                    <a:xfrm>
+                      <a:off x="0" y="0"/>
+                      <a:ext cx="5943600" cy="863476"/>
+                    </a:xfrm>
+                    <a:prstGeom prst="rect">
+                      <a:avLst/>
+                    </a:prstGeom>
+                  </pic:spPr>
+                </pic:pic>
+              </a:graphicData>
+            </a:graphic>
+          </wp:inline>
+        </w:drawing>
+      </w:r>
+    </w:p>
+    <w:p>
+      <w:pPr>
+        <w:keepNext/>
+        <w:spacing w:after="60" w:before="280"/>
+      </w:pPr>
+      <w:r>
+        <w:rPr>
+          <w:rFonts w:ascii="Calibri" w:cs="Calibri" w:eastAsia="Calibri" w:hAnsi="Calibri"/>
+          <w:b/>
+          <w:bCs/>
+          <w:color w:val="000000"/>
           <w:sz w:val="20"/>
           <w:szCs w:val="20"/>
         </w:rPr>
-        <w:br/>
-        <w:br/>
-        <w:br/>
-        <w:t xml:space="preserve">[ paste screenshot here ]</w:t>
-        <w:br/>
-        <w:br/>
-        <w:br/>
+        <w:t xml:space="preserve">Figure 2 — kubectl -n weather-monitoring get pods -o wide, showing all ten weather-station pods plus Kafka, ZooKeeper, PostgreSQL, the Central Station and the rain detector in Running state</w:t>
+      </w:r>
+    </w:p>
+    <w:p>
+      <w:pPr>
+        <w:spacing w:before="60" w:after="240"/>
+        <w:jc w:val="center"/>
+      </w:pPr>
+      <w:r>
+        <w:drawing>
+          <wp:inline distT="0" distB="0" distL="0" distR="0">
+            <wp:extent cx="5943600" cy="1862748"/>
+            <wp:effectExtent l="0" t="0" r="0" b="0"/>
+            <wp:docPr id="1002" name="Figure 2"/>
+            <wp:cNvGraphicFramePr>
+              <a:graphicFrameLocks xmlns:a="http://schemas.openxmlformats.org/drawingml/2006/main" noChangeAspect="1"/>
+            </wp:cNvGraphicFramePr>
+            <a:graphic xmlns:a="http://schemas.openxmlformats.org/drawingml/2006/main">
+              <a:graphicData uri="http://schemas.openxmlformats.org/drawingml/2006/picture">
+                <pic:pic xmlns:pic="http://schemas.openxmlformats.org/drawingml/2006/picture">
+                  <pic:nvPicPr>
+                    <pic:cNvPr id="1002" name="fig2.png"/>
+                    <pic:cNvPicPr/>
+                  </pic:nvPicPr>
+                  <pic:blipFill>
+                    <a:blip r:embed="rId101"/>
+                    <a:stretch>
+                      <a:fillRect/>
+                    </a:stretch>
+                  </pic:blipFill>
+                  <pic:spPr>
+                    <a:xfrm>
+                      <a:off x="0" y="0"/>
+                      <a:ext cx="5943600" cy="1862748"/>
+                    </a:xfrm>
+                    <a:prstGeom prst="rect">
+                      <a:avLst/>
+                    </a:prstGeom>
+                  </pic:spPr>
+                </pic:pic>
+              </a:graphicData>
+            </a:graphic>
+          </wp:inline>
+        </w:drawing>
       </w:r>
     </w:p>
     <w:p>
@@ -5621,37 +5694,110 @@
           <w:sz w:val="20"/>
           <w:szCs w:val="20"/>
         </w:rPr>
-        <w:t xml:space="preserve">Figure 2 — kubectl -n weather-monitoring get pods -o wide, showing all ten weather-station pods plus Kafka, ZooKeeper, PostgreSQL, the Central Station and the rain detector in Running state</w:t>
-      </w:r>
-    </w:p>
-    <w:p>
-      <w:pPr>
-        <w:pBdr>
-          <w:top w:val="dashed" w:color="A6A6A6" w:sz="6"/>
-          <w:left w:val="dashed" w:color="A6A6A6" w:sz="6"/>
-          <w:bottom w:val="dashed" w:color="A6A6A6" w:sz="6"/>
-          <w:right w:val="dashed" w:color="A6A6A6" w:sz="6"/>
-        </w:pBdr>
-        <w:shd w:fill="FAFAFA" w:val="clear"/>
-        <w:spacing w:before="120" w:after="240"/>
+        <w:t xml:space="preserve">Figure 3 — Weather station pod logs, showing per-second sends and occasional DROPPED messages</w:t>
+      </w:r>
+    </w:p>
+    <w:p>
+      <w:pPr>
+        <w:spacing w:before="60" w:after="240"/>
         <w:jc w:val="center"/>
       </w:pPr>
       <w:r>
-        <w:rPr>
-          <w:rFonts w:ascii="Calibri" w:cs="Calibri" w:eastAsia="Calibri" w:hAnsi="Calibri"/>
-          <w:i/>
-          <w:iCs/>
-          <w:color w:val="808080"/>
+        <w:drawing>
+          <wp:inline distT="0" distB="0" distL="0" distR="0">
+            <wp:extent cx="5943600" cy="4947747"/>
+            <wp:effectExtent l="0" t="0" r="0" b="0"/>
+            <wp:docPr id="1003" name="Figure 3"/>
+            <wp:cNvGraphicFramePr>
+              <a:graphicFrameLocks xmlns:a="http://schemas.openxmlformats.org/drawingml/2006/main" noChangeAspect="1"/>
+            </wp:cNvGraphicFramePr>
+            <a:graphic xmlns:a="http://schemas.openxmlformats.org/drawingml/2006/main">
+              <a:graphicData uri="http://schemas.openxmlformats.org/drawingml/2006/picture">
+                <pic:pic xmlns:pic="http://schemas.openxmlformats.org/drawingml/2006/picture">
+                  <pic:nvPicPr>
+                    <pic:cNvPr id="1003" name="fig3.png"/>
+                    <pic:cNvPicPr/>
+                  </pic:nvPicPr>
+                  <pic:blipFill>
+                    <a:blip r:embed="rId102"/>
+                    <a:stretch>
+                      <a:fillRect/>
+                    </a:stretch>
+                  </pic:blipFill>
+                  <pic:spPr>
+                    <a:xfrm>
+                      <a:off x="0" y="0"/>
+                      <a:ext cx="5943600" cy="4947747"/>
+                    </a:xfrm>
+                    <a:prstGeom prst="rect">
+                      <a:avLst/>
+                    </a:prstGeom>
+                  </pic:spPr>
+                </pic:pic>
+              </a:graphicData>
+            </a:graphic>
+          </wp:inline>
+        </w:drawing>
+      </w:r>
+    </w:p>
+    <w:p>
+      <w:pPr>
+        <w:keepNext/>
+        <w:spacing w:after="60" w:before="280"/>
+      </w:pPr>
+      <w:r>
+        <w:rPr>
+          <w:rFonts w:ascii="Calibri" w:cs="Calibri" w:eastAsia="Calibri" w:hAnsi="Calibri"/>
+          <w:b/>
+          <w:bCs/>
+          <w:color w:val="000000"/>
           <w:sz w:val="20"/>
           <w:szCs w:val="20"/>
         </w:rPr>
-        <w:br/>
-        <w:br/>
-        <w:br/>
-        <w:t xml:space="preserve">[ paste screenshot here ]</w:t>
-        <w:br/>
-        <w:br/>
-        <w:br/>
+        <w:t xml:space="preserve">Figure 4 — Central Station pod logs, showing 'Persisted batch of N readings'</w:t>
+      </w:r>
+    </w:p>
+    <w:p>
+      <w:pPr>
+        <w:spacing w:before="60" w:after="240"/>
+        <w:jc w:val="center"/>
+      </w:pPr>
+      <w:r>
+        <w:drawing>
+          <wp:inline distT="0" distB="0" distL="0" distR="0">
+            <wp:extent cx="5943600" cy="2026947"/>
+            <wp:effectExtent l="0" t="0" r="0" b="0"/>
+            <wp:docPr id="1004" name="Figure 4"/>
+            <wp:cNvGraphicFramePr>
+              <a:graphicFrameLocks xmlns:a="http://schemas.openxmlformats.org/drawingml/2006/main" noChangeAspect="1"/>
+            </wp:cNvGraphicFramePr>
+            <a:graphic xmlns:a="http://schemas.openxmlformats.org/drawingml/2006/main">
+              <a:graphicData uri="http://schemas.openxmlformats.org/drawingml/2006/picture">
+                <pic:pic xmlns:pic="http://schemas.openxmlformats.org/drawingml/2006/picture">
+                  <pic:nvPicPr>
+                    <pic:cNvPr id="1004" name="fig4.png"/>
+                    <pic:cNvPicPr/>
+                  </pic:nvPicPr>
+                  <pic:blipFill>
+                    <a:blip r:embed="rId103"/>
+                    <a:stretch>
+                      <a:fillRect/>
+                    </a:stretch>
+                  </pic:blipFill>
+                  <pic:spPr>
+                    <a:xfrm>
+                      <a:off x="0" y="0"/>
+                      <a:ext cx="5943600" cy="2026947"/>
+                    </a:xfrm>
+                    <a:prstGeom prst="rect">
+                      <a:avLst/>
+                    </a:prstGeom>
+                  </pic:spPr>
+                </pic:pic>
+              </a:graphicData>
+            </a:graphic>
+          </wp:inline>
+        </w:drawing>
       </w:r>
     </w:p>
     <w:p>
@@ -5668,37 +5814,110 @@
           <w:sz w:val="20"/>
           <w:szCs w:val="20"/>
         </w:rPr>
-        <w:t xml:space="preserve">Figure 3 — Weather station pod logs, showing per-second sends and occasional DROPPED messages</w:t>
-      </w:r>
-    </w:p>
-    <w:p>
-      <w:pPr>
-        <w:pBdr>
-          <w:top w:val="dashed" w:color="A6A6A6" w:sz="6"/>
-          <w:left w:val="dashed" w:color="A6A6A6" w:sz="6"/>
-          <w:bottom w:val="dashed" w:color="A6A6A6" w:sz="6"/>
-          <w:right w:val="dashed" w:color="A6A6A6" w:sz="6"/>
-        </w:pBdr>
-        <w:shd w:fill="FAFAFA" w:val="clear"/>
-        <w:spacing w:before="120" w:after="240"/>
+        <w:t xml:space="preserve">Figure 5 — kafka-console-consumer output from the weather-readings topic</w:t>
+      </w:r>
+    </w:p>
+    <w:p>
+      <w:pPr>
+        <w:spacing w:before="60" w:after="240"/>
         <w:jc w:val="center"/>
       </w:pPr>
       <w:r>
-        <w:rPr>
-          <w:rFonts w:ascii="Calibri" w:cs="Calibri" w:eastAsia="Calibri" w:hAnsi="Calibri"/>
-          <w:i/>
-          <w:iCs/>
-          <w:color w:val="808080"/>
+        <w:drawing>
+          <wp:inline distT="0" distB="0" distL="0" distR="0">
+            <wp:extent cx="5943600" cy="1174624"/>
+            <wp:effectExtent l="0" t="0" r="0" b="0"/>
+            <wp:docPr id="1005" name="Figure 5"/>
+            <wp:cNvGraphicFramePr>
+              <a:graphicFrameLocks xmlns:a="http://schemas.openxmlformats.org/drawingml/2006/main" noChangeAspect="1"/>
+            </wp:cNvGraphicFramePr>
+            <a:graphic xmlns:a="http://schemas.openxmlformats.org/drawingml/2006/main">
+              <a:graphicData uri="http://schemas.openxmlformats.org/drawingml/2006/picture">
+                <pic:pic xmlns:pic="http://schemas.openxmlformats.org/drawingml/2006/picture">
+                  <pic:nvPicPr>
+                    <pic:cNvPr id="1005" name="fig5.png"/>
+                    <pic:cNvPicPr/>
+                  </pic:nvPicPr>
+                  <pic:blipFill>
+                    <a:blip r:embed="rId104"/>
+                    <a:stretch>
+                      <a:fillRect/>
+                    </a:stretch>
+                  </pic:blipFill>
+                  <pic:spPr>
+                    <a:xfrm>
+                      <a:off x="0" y="0"/>
+                      <a:ext cx="5943600" cy="1174624"/>
+                    </a:xfrm>
+                    <a:prstGeom prst="rect">
+                      <a:avLst/>
+                    </a:prstGeom>
+                  </pic:spPr>
+                </pic:pic>
+              </a:graphicData>
+            </a:graphic>
+          </wp:inline>
+        </w:drawing>
+      </w:r>
+    </w:p>
+    <w:p>
+      <w:pPr>
+        <w:keepNext/>
+        <w:spacing w:after="60" w:before="280"/>
+      </w:pPr>
+      <w:r>
+        <w:rPr>
+          <w:rFonts w:ascii="Calibri" w:cs="Calibri" w:eastAsia="Calibri" w:hAnsi="Calibri"/>
+          <w:b/>
+          <w:bCs/>
+          <w:color w:val="000000"/>
           <w:sz w:val="20"/>
           <w:szCs w:val="20"/>
         </w:rPr>
-        <w:br/>
-        <w:br/>
-        <w:br/>
-        <w:t xml:space="preserve">[ paste screenshot here ]</w:t>
-        <w:br/>
-        <w:br/>
-        <w:br/>
+        <w:t xml:space="preserve">Figure 6 — kafka-console-consumer output from the rain-alerts topic, with every humidity above 70</w:t>
+      </w:r>
+    </w:p>
+    <w:p>
+      <w:pPr>
+        <w:spacing w:before="60" w:after="240"/>
+        <w:jc w:val="center"/>
+      </w:pPr>
+      <w:r>
+        <w:drawing>
+          <wp:inline distT="0" distB="0" distL="0" distR="0">
+            <wp:extent cx="5943600" cy="1110502"/>
+            <wp:effectExtent l="0" t="0" r="0" b="0"/>
+            <wp:docPr id="1006" name="Figure 6"/>
+            <wp:cNvGraphicFramePr>
+              <a:graphicFrameLocks xmlns:a="http://schemas.openxmlformats.org/drawingml/2006/main" noChangeAspect="1"/>
+            </wp:cNvGraphicFramePr>
+            <a:graphic xmlns:a="http://schemas.openxmlformats.org/drawingml/2006/main">
+              <a:graphicData uri="http://schemas.openxmlformats.org/drawingml/2006/picture">
+                <pic:pic xmlns:pic="http://schemas.openxmlformats.org/drawingml/2006/picture">
+                  <pic:nvPicPr>
+                    <pic:cNvPr id="1006" name="fig6.png"/>
+                    <pic:cNvPicPr/>
+                  </pic:nvPicPr>
+                  <pic:blipFill>
+                    <a:blip r:embed="rId105"/>
+                    <a:stretch>
+                      <a:fillRect/>
+                    </a:stretch>
+                  </pic:blipFill>
+                  <pic:spPr>
+                    <a:xfrm>
+                      <a:off x="0" y="0"/>
+                      <a:ext cx="5943600" cy="1110502"/>
+                    </a:xfrm>
+                    <a:prstGeom prst="rect">
+                      <a:avLst/>
+                    </a:prstGeom>
+                  </pic:spPr>
+                </pic:pic>
+              </a:graphicData>
+            </a:graphic>
+          </wp:inline>
+        </w:drawing>
       </w:r>
     </w:p>
     <w:p>
@@ -5715,37 +5934,110 @@
           <w:sz w:val="20"/>
           <w:szCs w:val="20"/>
         </w:rPr>
-        <w:t xml:space="preserve">Figure 4 — Central Station pod logs, showing 'Persisted batch of N readings'</w:t>
-      </w:r>
-    </w:p>
-    <w:p>
-      <w:pPr>
-        <w:pBdr>
-          <w:top w:val="dashed" w:color="A6A6A6" w:sz="6"/>
-          <w:left w:val="dashed" w:color="A6A6A6" w:sz="6"/>
-          <w:bottom w:val="dashed" w:color="A6A6A6" w:sz="6"/>
-          <w:right w:val="dashed" w:color="A6A6A6" w:sz="6"/>
-        </w:pBdr>
-        <w:shd w:fill="FAFAFA" w:val="clear"/>
-        <w:spacing w:before="120" w:after="240"/>
+        <w:t xml:space="preserve">Figure 7 — Per-station row counts from PostgreSQL, confirming all ten station IDs are present</w:t>
+      </w:r>
+    </w:p>
+    <w:p>
+      <w:pPr>
+        <w:spacing w:before="60" w:after="240"/>
         <w:jc w:val="center"/>
       </w:pPr>
       <w:r>
-        <w:rPr>
-          <w:rFonts w:ascii="Calibri" w:cs="Calibri" w:eastAsia="Calibri" w:hAnsi="Calibri"/>
-          <w:i/>
-          <w:iCs/>
-          <w:color w:val="808080"/>
+        <w:drawing>
+          <wp:inline distT="0" distB="0" distL="0" distR="0">
+            <wp:extent cx="5943600" cy="1669486"/>
+            <wp:effectExtent l="0" t="0" r="0" b="0"/>
+            <wp:docPr id="1007" name="Figure 7"/>
+            <wp:cNvGraphicFramePr>
+              <a:graphicFrameLocks xmlns:a="http://schemas.openxmlformats.org/drawingml/2006/main" noChangeAspect="1"/>
+            </wp:cNvGraphicFramePr>
+            <a:graphic xmlns:a="http://schemas.openxmlformats.org/drawingml/2006/main">
+              <a:graphicData uri="http://schemas.openxmlformats.org/drawingml/2006/picture">
+                <pic:pic xmlns:pic="http://schemas.openxmlformats.org/drawingml/2006/picture">
+                  <pic:nvPicPr>
+                    <pic:cNvPr id="1007" name="fig7.png"/>
+                    <pic:cNvPicPr/>
+                  </pic:nvPicPr>
+                  <pic:blipFill>
+                    <a:blip r:embed="rId106"/>
+                    <a:stretch>
+                      <a:fillRect/>
+                    </a:stretch>
+                  </pic:blipFill>
+                  <pic:spPr>
+                    <a:xfrm>
+                      <a:off x="0" y="0"/>
+                      <a:ext cx="5943600" cy="1669486"/>
+                    </a:xfrm>
+                    <a:prstGeom prst="rect">
+                      <a:avLst/>
+                    </a:prstGeom>
+                  </pic:spPr>
+                </pic:pic>
+              </a:graphicData>
+            </a:graphic>
+          </wp:inline>
+        </w:drawing>
+      </w:r>
+    </w:p>
+    <w:p>
+      <w:pPr>
+        <w:keepNext/>
+        <w:spacing w:after="60" w:before="280"/>
+      </w:pPr>
+      <w:r>
+        <w:rPr>
+          <w:rFonts w:ascii="Calibri" w:cs="Calibri" w:eastAsia="Calibri" w:hAnsi="Calibri"/>
+          <w:b/>
+          <w:bCs/>
+          <w:color w:val="000000"/>
           <w:sz w:val="20"/>
           <w:szCs w:val="20"/>
         </w:rPr>
-        <w:br/>
-        <w:br/>
-        <w:br/>
-        <w:t xml:space="preserve">[ paste screenshot here ]</w:t>
-        <w:br/>
-        <w:br/>
-        <w:br/>
+        <w:t xml:space="preserve">Figure 8 — Part E query 1 — battery status distribution per station, trending towards 30/40/30</w:t>
+      </w:r>
+    </w:p>
+    <w:p>
+      <w:pPr>
+        <w:spacing w:before="60" w:after="240"/>
+        <w:jc w:val="center"/>
+      </w:pPr>
+      <w:r>
+        <w:drawing>
+          <wp:inline distT="0" distB="0" distL="0" distR="0">
+            <wp:extent cx="5943600" cy="4019993"/>
+            <wp:effectExtent l="0" t="0" r="0" b="0"/>
+            <wp:docPr id="1008" name="Figure 8"/>
+            <wp:cNvGraphicFramePr>
+              <a:graphicFrameLocks xmlns:a="http://schemas.openxmlformats.org/drawingml/2006/main" noChangeAspect="1"/>
+            </wp:cNvGraphicFramePr>
+            <a:graphic xmlns:a="http://schemas.openxmlformats.org/drawingml/2006/main">
+              <a:graphicData uri="http://schemas.openxmlformats.org/drawingml/2006/picture">
+                <pic:pic xmlns:pic="http://schemas.openxmlformats.org/drawingml/2006/picture">
+                  <pic:nvPicPr>
+                    <pic:cNvPr id="1008" name="fig8.png"/>
+                    <pic:cNvPicPr/>
+                  </pic:nvPicPr>
+                  <pic:blipFill>
+                    <a:blip r:embed="rId107"/>
+                    <a:stretch>
+                      <a:fillRect/>
+                    </a:stretch>
+                  </pic:blipFill>
+                  <pic:spPr>
+                    <a:xfrm>
+                      <a:off x="0" y="0"/>
+                      <a:ext cx="5943600" cy="4019993"/>
+                    </a:xfrm>
+                    <a:prstGeom prst="rect">
+                      <a:avLst/>
+                    </a:prstGeom>
+                  </pic:spPr>
+                </pic:pic>
+              </a:graphicData>
+            </a:graphic>
+          </wp:inline>
+        </w:drawing>
       </w:r>
     </w:p>
     <w:p>
@@ -5762,225 +6054,50 @@
           <w:sz w:val="20"/>
           <w:szCs w:val="20"/>
         </w:rPr>
-        <w:t xml:space="preserve">Figure 5 — kafka-console-consumer output from the weather-readings topic</w:t>
-      </w:r>
-    </w:p>
-    <w:p>
-      <w:pPr>
-        <w:pBdr>
-          <w:top w:val="dashed" w:color="A6A6A6" w:sz="6"/>
-          <w:left w:val="dashed" w:color="A6A6A6" w:sz="6"/>
-          <w:bottom w:val="dashed" w:color="A6A6A6" w:sz="6"/>
-          <w:right w:val="dashed" w:color="A6A6A6" w:sz="6"/>
-        </w:pBdr>
-        <w:shd w:fill="FAFAFA" w:val="clear"/>
-        <w:spacing w:before="120" w:after="240"/>
+        <w:t xml:space="preserve">Figure 9 — Part E query 2 — expected vs received messages per station, trending towards a 10% drop rate</w:t>
+      </w:r>
+    </w:p>
+    <w:p>
+      <w:pPr>
+        <w:spacing w:before="60" w:after="240"/>
         <w:jc w:val="center"/>
       </w:pPr>
       <w:r>
-        <w:rPr>
-          <w:rFonts w:ascii="Calibri" w:cs="Calibri" w:eastAsia="Calibri" w:hAnsi="Calibri"/>
-          <w:i/>
-          <w:iCs/>
-          <w:color w:val="808080"/>
-          <w:sz w:val="20"/>
-          <w:szCs w:val="20"/>
-        </w:rPr>
-        <w:br/>
-        <w:br/>
-        <w:br/>
-        <w:t xml:space="preserve">[ paste screenshot here ]</w:t>
-        <w:br/>
-        <w:br/>
-        <w:br/>
-      </w:r>
-    </w:p>
-    <w:p>
-      <w:pPr>
-        <w:keepNext/>
-        <w:spacing w:after="60" w:before="280"/>
-      </w:pPr>
-      <w:r>
-        <w:rPr>
-          <w:rFonts w:ascii="Calibri" w:cs="Calibri" w:eastAsia="Calibri" w:hAnsi="Calibri"/>
-          <w:b/>
-          <w:bCs/>
-          <w:color w:val="000000"/>
-          <w:sz w:val="20"/>
-          <w:szCs w:val="20"/>
-        </w:rPr>
-        <w:t xml:space="preserve">Figure 6 — kafka-console-consumer output from the rain-alerts topic, with every humidity above 70</w:t>
-      </w:r>
-    </w:p>
-    <w:p>
-      <w:pPr>
-        <w:pBdr>
-          <w:top w:val="dashed" w:color="A6A6A6" w:sz="6"/>
-          <w:left w:val="dashed" w:color="A6A6A6" w:sz="6"/>
-          <w:bottom w:val="dashed" w:color="A6A6A6" w:sz="6"/>
-          <w:right w:val="dashed" w:color="A6A6A6" w:sz="6"/>
-        </w:pBdr>
-        <w:shd w:fill="FAFAFA" w:val="clear"/>
-        <w:spacing w:before="120" w:after="240"/>
-        <w:jc w:val="center"/>
-      </w:pPr>
-      <w:r>
-        <w:rPr>
-          <w:rFonts w:ascii="Calibri" w:cs="Calibri" w:eastAsia="Calibri" w:hAnsi="Calibri"/>
-          <w:i/>
-          <w:iCs/>
-          <w:color w:val="808080"/>
-          <w:sz w:val="20"/>
-          <w:szCs w:val="20"/>
-        </w:rPr>
-        <w:br/>
-        <w:br/>
-        <w:br/>
-        <w:t xml:space="preserve">[ paste screenshot here ]</w:t>
-        <w:br/>
-        <w:br/>
-        <w:br/>
-      </w:r>
-    </w:p>
-    <w:p>
-      <w:pPr>
-        <w:keepNext/>
-        <w:spacing w:after="60" w:before="280"/>
-      </w:pPr>
-      <w:r>
-        <w:rPr>
-          <w:rFonts w:ascii="Calibri" w:cs="Calibri" w:eastAsia="Calibri" w:hAnsi="Calibri"/>
-          <w:b/>
-          <w:bCs/>
-          <w:color w:val="000000"/>
-          <w:sz w:val="20"/>
-          <w:szCs w:val="20"/>
-        </w:rPr>
-        <w:t xml:space="preserve">Figure 7 — Per-station row counts from PostgreSQL, confirming all ten station IDs are present</w:t>
-      </w:r>
-    </w:p>
-    <w:p>
-      <w:pPr>
-        <w:pBdr>
-          <w:top w:val="dashed" w:color="A6A6A6" w:sz="6"/>
-          <w:left w:val="dashed" w:color="A6A6A6" w:sz="6"/>
-          <w:bottom w:val="dashed" w:color="A6A6A6" w:sz="6"/>
-          <w:right w:val="dashed" w:color="A6A6A6" w:sz="6"/>
-        </w:pBdr>
-        <w:shd w:fill="FAFAFA" w:val="clear"/>
-        <w:spacing w:before="120" w:after="240"/>
-        <w:jc w:val="center"/>
-      </w:pPr>
-      <w:r>
-        <w:rPr>
-          <w:rFonts w:ascii="Calibri" w:cs="Calibri" w:eastAsia="Calibri" w:hAnsi="Calibri"/>
-          <w:i/>
-          <w:iCs/>
-          <w:color w:val="808080"/>
-          <w:sz w:val="20"/>
-          <w:szCs w:val="20"/>
-        </w:rPr>
-        <w:br/>
-        <w:br/>
-        <w:br/>
-        <w:t xml:space="preserve">[ paste screenshot here ]</w:t>
-        <w:br/>
-        <w:br/>
-        <w:br/>
-      </w:r>
-    </w:p>
-    <w:p>
-      <w:pPr>
-        <w:keepNext/>
-        <w:spacing w:after="60" w:before="280"/>
-      </w:pPr>
-      <w:r>
-        <w:rPr>
-          <w:rFonts w:ascii="Calibri" w:cs="Calibri" w:eastAsia="Calibri" w:hAnsi="Calibri"/>
-          <w:b/>
-          <w:bCs/>
-          <w:color w:val="000000"/>
-          <w:sz w:val="20"/>
-          <w:szCs w:val="20"/>
-        </w:rPr>
-        <w:t xml:space="preserve">Figure 8 — Part E query 1 — battery status distribution per station, trending towards 30/40/30</w:t>
-      </w:r>
-    </w:p>
-    <w:p>
-      <w:pPr>
-        <w:pBdr>
-          <w:top w:val="dashed" w:color="A6A6A6" w:sz="6"/>
-          <w:left w:val="dashed" w:color="A6A6A6" w:sz="6"/>
-          <w:bottom w:val="dashed" w:color="A6A6A6" w:sz="6"/>
-          <w:right w:val="dashed" w:color="A6A6A6" w:sz="6"/>
-        </w:pBdr>
-        <w:shd w:fill="FAFAFA" w:val="clear"/>
-        <w:spacing w:before="120" w:after="240"/>
-        <w:jc w:val="center"/>
-      </w:pPr>
-      <w:r>
-        <w:rPr>
-          <w:rFonts w:ascii="Calibri" w:cs="Calibri" w:eastAsia="Calibri" w:hAnsi="Calibri"/>
-          <w:i/>
-          <w:iCs/>
-          <w:color w:val="808080"/>
-          <w:sz w:val="20"/>
-          <w:szCs w:val="20"/>
-        </w:rPr>
-        <w:br/>
-        <w:br/>
-        <w:br/>
-        <w:t xml:space="preserve">[ paste screenshot here ]</w:t>
-        <w:br/>
-        <w:br/>
-        <w:br/>
-      </w:r>
-    </w:p>
-    <w:p>
-      <w:pPr>
-        <w:keepNext/>
-        <w:spacing w:after="60" w:before="280"/>
-      </w:pPr>
-      <w:r>
-        <w:rPr>
-          <w:rFonts w:ascii="Calibri" w:cs="Calibri" w:eastAsia="Calibri" w:hAnsi="Calibri"/>
-          <w:b/>
-          <w:bCs/>
-          <w:color w:val="000000"/>
-          <w:sz w:val="20"/>
-          <w:szCs w:val="20"/>
-        </w:rPr>
-        <w:t xml:space="preserve">Figure 9 — Part E query 2 — expected vs received messages per station, trending towards a 10% drop rate</w:t>
-      </w:r>
-    </w:p>
-    <w:p>
-      <w:pPr>
-        <w:pBdr>
-          <w:top w:val="dashed" w:color="A6A6A6" w:sz="6"/>
-          <w:left w:val="dashed" w:color="A6A6A6" w:sz="6"/>
-          <w:bottom w:val="dashed" w:color="A6A6A6" w:sz="6"/>
-          <w:right w:val="dashed" w:color="A6A6A6" w:sz="6"/>
-        </w:pBdr>
-        <w:shd w:fill="FAFAFA" w:val="clear"/>
-        <w:spacing w:before="120" w:after="240"/>
-        <w:jc w:val="center"/>
-      </w:pPr>
-      <w:r>
-        <w:rPr>
-          <w:rFonts w:ascii="Calibri" w:cs="Calibri" w:eastAsia="Calibri" w:hAnsi="Calibri"/>
-          <w:i/>
-          <w:iCs/>
-          <w:color w:val="808080"/>
-          <w:sz w:val="20"/>
-          <w:szCs w:val="20"/>
-        </w:rPr>
-        <w:br/>
-        <w:br/>
-        <w:br/>
-        <w:t xml:space="preserve">[ paste screenshot here ]</w:t>
-        <w:br/>
-        <w:br/>
-        <w:br/>
+        <w:drawing>
+          <wp:inline distT="0" distB="0" distL="0" distR="0">
+            <wp:extent cx="5943600" cy="1900803"/>
+            <wp:effectExtent l="0" t="0" r="0" b="0"/>
+            <wp:docPr id="1009" name="Figure 9"/>
+            <wp:cNvGraphicFramePr>
+              <a:graphicFrameLocks xmlns:a="http://schemas.openxmlformats.org/drawingml/2006/main" noChangeAspect="1"/>
+            </wp:cNvGraphicFramePr>
+            <a:graphic xmlns:a="http://schemas.openxmlformats.org/drawingml/2006/main">
+              <a:graphicData uri="http://schemas.openxmlformats.org/drawingml/2006/picture">
+                <pic:pic xmlns:pic="http://schemas.openxmlformats.org/drawingml/2006/picture">
+                  <pic:nvPicPr>
+                    <pic:cNvPr id="1009" name="fig9.png"/>
+                    <pic:cNvPicPr/>
+                  </pic:nvPicPr>
+                  <pic:blipFill>
+                    <a:blip r:embed="rId108"/>
+                    <a:stretch>
+                      <a:fillRect/>
+                    </a:stretch>
+                  </pic:blipFill>
+                  <pic:spPr>
+                    <a:xfrm>
+                      <a:off x="0" y="0"/>
+                      <a:ext cx="5943600" cy="1900803"/>
+                    </a:xfrm>
+                    <a:prstGeom prst="rect">
+                      <a:avLst/>
+                    </a:prstGeom>
+                  </pic:spPr>
+                </pic:pic>
+              </a:graphicData>
+            </a:graphic>
+          </wp:inline>
+        </w:drawing>
       </w:r>
     </w:p>
     <w:p>

</xml_diff>

<commit_message>
revert: drop the cloud bonus and add the author list
The bonus is not being attempted. Every provider that offers a free tier
large enough to run ten JVMs — Oracle Cloud, AWS, and Azure for Students —
requires a payment card for identity verification, and none was available.
Rather than submit Section 9 with nine empty evidence boxes, the section is
removed along with the cloud/ deployment assets and the bonus rows in the
README checklist.

The Compose stacks and the deployment guide remain in the history at
129b348 if the bonus is ever picked up; they were verified as far as
configuration but never against running instances.

Also adds the four authors and their IDs beneath the report title.
</commit_message>
<xml_diff>
--- a/Lab4_Weather_Monitoring_Report.docx
+++ b/Lab4_Weather_Monitoring_Report.docx
@@ -70,6 +70,96 @@
           <w:szCs w:val="26"/>
         </w:rPr>
         <w:t xml:space="preserve">Technical Report</w:t>
+      </w:r>
+    </w:p>
+    <w:p>
+      <w:pPr>
+        <w:spacing w:before="240" w:after="80"/>
+      </w:pPr>
+      <w:r>
+        <w:rPr>
+          <w:rFonts w:ascii="Calibri" w:cs="Calibri" w:eastAsia="Calibri" w:hAnsi="Calibri"/>
+          <w:b/>
+          <w:bCs/>
+          <w:color w:val="000000"/>
+        </w:rPr>
+        <w:t xml:space="preserve">Authors</w:t>
+      </w:r>
+    </w:p>
+    <w:p>
+      <w:pPr>
+        <w:spacing w:after="40"/>
+      </w:pPr>
+      <w:r>
+        <w:rPr>
+          <w:rFonts w:ascii="Calibri" w:cs="Calibri" w:eastAsia="Calibri" w:hAnsi="Calibri"/>
+          <w:color w:val="000000"/>
+        </w:rPr>
+        <w:t xml:space="preserve">Abdelrahman Youssef</w:t>
+      </w:r>
+      <w:r>
+        <w:rPr>
+          <w:rFonts w:ascii="Calibri" w:cs="Calibri" w:eastAsia="Calibri" w:hAnsi="Calibri"/>
+          <w:color w:val="595959"/>
+        </w:rPr>
+        <w:t xml:space="preserve">   —   8711</w:t>
+      </w:r>
+    </w:p>
+    <w:p>
+      <w:pPr>
+        <w:spacing w:after="40"/>
+      </w:pPr>
+      <w:r>
+        <w:rPr>
+          <w:rFonts w:ascii="Calibri" w:cs="Calibri" w:eastAsia="Calibri" w:hAnsi="Calibri"/>
+          <w:color w:val="000000"/>
+        </w:rPr>
+        <w:t xml:space="preserve">We Fouad Moahmed</w:t>
+      </w:r>
+      <w:r>
+        <w:rPr>
+          <w:rFonts w:ascii="Calibri" w:cs="Calibri" w:eastAsia="Calibri" w:hAnsi="Calibri"/>
+          <w:color w:val="595959"/>
+        </w:rPr>
+        <w:t xml:space="preserve">   —   8612</w:t>
+      </w:r>
+    </w:p>
+    <w:p>
+      <w:pPr>
+        <w:spacing w:after="40"/>
+      </w:pPr>
+      <w:r>
+        <w:rPr>
+          <w:rFonts w:ascii="Calibri" w:cs="Calibri" w:eastAsia="Calibri" w:hAnsi="Calibri"/>
+          <w:color w:val="000000"/>
+        </w:rPr>
+        <w:t xml:space="preserve">Ahmed Hesham</w:t>
+      </w:r>
+      <w:r>
+        <w:rPr>
+          <w:rFonts w:ascii="Calibri" w:cs="Calibri" w:eastAsia="Calibri" w:hAnsi="Calibri"/>
+          <w:color w:val="595959"/>
+        </w:rPr>
+        <w:t xml:space="preserve">   —   8847</w:t>
+      </w:r>
+    </w:p>
+    <w:p>
+      <w:pPr>
+        <w:spacing w:after="40"/>
+      </w:pPr>
+      <w:r>
+        <w:rPr>
+          <w:rFonts w:ascii="Calibri" w:cs="Calibri" w:eastAsia="Calibri" w:hAnsi="Calibri"/>
+          <w:color w:val="000000"/>
+        </w:rPr>
+        <w:t xml:space="preserve">Ahmed Nader</w:t>
+      </w:r>
+      <w:r>
+        <w:rPr>
+          <w:rFonts w:ascii="Calibri" w:cs="Calibri" w:eastAsia="Calibri" w:hAnsi="Calibri"/>
+          <w:color w:val="595959"/>
+        </w:rPr>
+        <w:t xml:space="preserve">   —   9168</w:t>
       </w:r>
     </w:p>
     <w:p>
@@ -395,7 +485,7 @@
           <w:rFonts w:ascii="Calibri" w:cs="Calibri" w:eastAsia="Calibri" w:hAnsi="Calibri"/>
           <w:color w:val="000000"/>
         </w:rPr>
-        <w:t xml:space="preserve">The mandatory deployment target is Kubernetes, and is documented in Section 8; the two-VM cloud deployment is documented in Section 9. This section describes the native environment used for day-to-day development, in which all components were installed and run inside WSL (Ubuntu), with the Java source developed in IntelliJ IDEA on Windows against the project mounted through the WSL filesystem.</w:t>
+        <w:t xml:space="preserve">The mandatory deployment target is Kubernetes, and is documented in Section 8. This section describes the native environment used for day-to-day development, in which all components were installed and run inside WSL (Ubuntu), with the Java source developed in IntelliJ IDEA on Windows against the project mounted through the WSL filesystem.</w:t>
       </w:r>
     </w:p>
     <w:p>
@@ -3682,7 +3772,7 @@
           <w:rFonts w:ascii="Calibri" w:cs="Calibri" w:eastAsia="Calibri" w:hAnsi="Calibri"/>
           <w:color w:val="000000"/>
         </w:rPr>
-        <w:t xml:space="preserve">Containerization and orchestration are complete and are covered by Sections 8 and 9: Dockerfiles for both services, and Kubernetes manifests for the ten station pods, Kafka, Zookeeper, the Central Station, the rain detector, and PostgreSQL with persistent storage. Section 9 covers the two-VM cloud deployment and the managed database used for the bonus.</w:t>
+        <w:t xml:space="preserve">Containerization and orchestration are complete and are covered by Section 8: Dockerfiles for both services, and Kubernetes manifests for the ten station pods, Kafka, Zookeeper, the Central Station, the rain detector, and PostgreSQL with persistent storage.</w:t>
       </w:r>
     </w:p>
     <w:p>
@@ -6100,848 +6190,6 @@
         </w:drawing>
       </w:r>
     </w:p>
-    <w:p>
-      <w:pPr>
-        <w:pStyle w:val="Heading1"/>
-        <w:spacing w:after="160" w:before="360"/>
-      </w:pPr>
-      <w:r>
-        <w:rPr>
-          <w:rFonts w:ascii="Calibri" w:cs="Calibri" w:eastAsia="Calibri" w:hAnsi="Calibri"/>
-          <w:b/>
-          <w:bCs/>
-          <w:color w:val="000000"/>
-        </w:rPr>
-        <w:t xml:space="preserve">9. Cloud Deployment (Bonus)</w:t>
-      </w:r>
-    </w:p>
-    <w:p>
-      <w:pPr>
-        <w:spacing w:after="160" w:line="276"/>
-      </w:pPr>
-      <w:r>
-        <w:rPr>
-          <w:rFonts w:ascii="Calibri" w:cs="Calibri" w:eastAsia="Calibri" w:hAnsi="Calibri"/>
-          <w:color w:val="000000"/>
-        </w:rPr>
-        <w:t xml:space="preserve">The bonus deployment runs the same system on two Microsoft Azure virtual machines without Kubernetes, writing to a managed PostgreSQL database hosted by Aiven. The weather stations and the central base station are on separate machines, as required. Each machine is described by a Docker Compose file under cloud/. The deployment assets and procedure below are complete; the instances themselves must still be provisioned and the evidence in Section 9.7 captured.</w:t>
-      </w:r>
-    </w:p>
-    <w:p>
-      <w:pPr>
-        <w:pStyle w:val="Heading2"/>
-        <w:spacing w:after="120" w:before="240"/>
-      </w:pPr>
-      <w:r>
-        <w:rPr>
-          <w:rFonts w:ascii="Calibri" w:cs="Calibri" w:eastAsia="Calibri" w:hAnsi="Calibri"/>
-          <w:b/>
-          <w:bCs/>
-          <w:color w:val="000000"/>
-        </w:rPr>
-        <w:t xml:space="preserve">9.1 Topology</w:t>
-      </w:r>
-    </w:p>
-    <w:p>
-      <w:pPr>
-        <w:pStyle w:val="ListParagraph"/>
-        <w:numPr>
-          <w:ilvl w:val="0"/>
-          <w:numId w:val="2"/>
-        </w:numPr>
-        <w:spacing w:after="80"/>
-      </w:pPr>
-      <w:r>
-        <w:rPr>
-          <w:rFonts w:ascii="Calibri" w:cs="Calibri" w:eastAsia="Calibri" w:hAnsi="Calibri"/>
-          <w:color w:val="000000"/>
-        </w:rPr>
-        <w:t xml:space="preserve">Weather Stations VM: ten station containers, one per station ID. Holds no state and no credentials.</w:t>
-      </w:r>
-    </w:p>
-    <w:p>
-      <w:pPr>
-        <w:pStyle w:val="ListParagraph"/>
-        <w:numPr>
-          <w:ilvl w:val="0"/>
-          <w:numId w:val="2"/>
-        </w:numPr>
-        <w:spacing w:after="80"/>
-      </w:pPr>
-      <w:r>
-        <w:rPr>
-          <w:rFonts w:ascii="Calibri" w:cs="Calibri" w:eastAsia="Calibri" w:hAnsi="Calibri"/>
-          <w:color w:val="000000"/>
-        </w:rPr>
-        <w:t xml:space="preserve">Central Base Station VM: ZooKeeper, the Kafka broker, the Central Station consumer and the Kafka Streams rain detector.</w:t>
-      </w:r>
-    </w:p>
-    <w:p>
-      <w:pPr>
-        <w:pStyle w:val="ListParagraph"/>
-        <w:numPr>
-          <w:ilvl w:val="0"/>
-          <w:numId w:val="2"/>
-        </w:numPr>
-        <w:spacing w:after="80"/>
-      </w:pPr>
-      <w:r>
-        <w:rPr>
-          <w:rFonts w:ascii="Calibri" w:cs="Calibri" w:eastAsia="Calibri" w:hAnsi="Calibri"/>
-          <w:color w:val="000000"/>
-        </w:rPr>
-        <w:t xml:space="preserve">Aiven PostgreSQL: managed, external to both machines, reached over TLS.</w:t>
-      </w:r>
-    </w:p>
-    <w:p>
-      <w:pPr>
-        <w:spacing w:after="160" w:line="276"/>
-      </w:pPr>
-      <w:r>
-        <w:rPr>
-          <w:rFonts w:ascii="Calibri" w:cs="Calibri" w:eastAsia="Calibri" w:hAnsi="Calibri"/>
-          <w:color w:val="000000"/>
-        </w:rPr>
-        <w:t xml:space="preserve">The stations hold no state and no credentials; they need only network reach to the broker. All database configuration lives on the central VM alone, which keeps the credential surface to a single machine.</w:t>
-      </w:r>
-    </w:p>
-    <w:p>
-      <w:pPr>
-        <w:pStyle w:val="Heading2"/>
-        <w:spacing w:after="120" w:before="240"/>
-      </w:pPr>
-      <w:r>
-        <w:rPr>
-          <w:rFonts w:ascii="Calibri" w:cs="Calibri" w:eastAsia="Calibri" w:hAnsi="Calibri"/>
-          <w:b/>
-          <w:bCs/>
-          <w:color w:val="000000"/>
-        </w:rPr>
-        <w:t xml:space="preserve">9.2 Machine specifications</w:t>
-      </w:r>
-    </w:p>
-    <w:p>
-      <w:pPr>
-        <w:spacing w:after="160" w:line="276"/>
-      </w:pPr>
-      <w:r>
-        <w:rPr>
-          <w:rFonts w:ascii="Calibri" w:cs="Calibri" w:eastAsia="Calibri" w:hAnsi="Calibri"/>
-          <w:color w:val="000000"/>
-        </w:rPr>
-        <w:t xml:space="preserve">The stations VM is a Standard_B1ms (1 vCPU, 2 GiB) and the central VM a Standard_B2s (2 vCPU, 4 GiB), both running Ubuntu Server 24.04 LTS. Azure was chosen because Azure for Students grants USD 100 of credit without requiring a payment card, which Oracle Cloud and AWS both demand for identity verification. The sizes are set by a hard constraint: an Azure for Students subscription is capped at 3 vCPUs in total and is not eligible for a quota increase, so the two machines must fit inside that budget. The sizes that come with free hours all carry only 1 GiB of RAM, which is insufficient, so these slightly larger burstable sizes are paid out of the credit at a cost of well under one dollar for the duration of the exercise. The asymmetric split reflects where the memory is actually needed: Kafka and ZooKeeper together dominate the central VM, while a weather station was measured at roughly 78 MiB of resident memory, so ten of them and the operating system fit 2 GiB with room to spare.</w:t>
-      </w:r>
-    </w:p>
-    <w:p>
-      <w:pPr>
-        <w:pStyle w:val="Heading2"/>
-        <w:spacing w:after="120" w:before="240"/>
-      </w:pPr>
-      <w:r>
-        <w:rPr>
-          <w:rFonts w:ascii="Calibri" w:cs="Calibri" w:eastAsia="Calibri" w:hAnsi="Calibri"/>
-          <w:b/>
-          <w:bCs/>
-          <w:color w:val="000000"/>
-        </w:rPr>
-        <w:t xml:space="preserve">9.3 Network configuration</w:t>
-      </w:r>
-    </w:p>
-    <w:p>
-      <w:pPr>
-        <w:spacing w:after="160" w:line="276"/>
-      </w:pPr>
-      <w:r>
-        <w:rPr>
-          <w:rFonts w:ascii="Calibri" w:cs="Calibri" w:eastAsia="Calibri" w:hAnsi="Calibri"/>
-          <w:color w:val="000000"/>
-        </w:rPr>
-        <w:t xml:space="preserve">Both virtual machines are placed in a single Azure virtual network, and the stations reach the broker over the central VM's private address. Azure's default AllowVnetInBound network security group rule already permits traffic within the virtual network, so port 9092 is never exposed to the internet and no additional inbound rule is required. The only inbound rule either machine carries is SSH on port 22, restricted to the administrator's address. Outbound is left at the default allow-all, which is what lets the central VM reach Aiven on port 5432. On the Aiven side, the allowed-address list contains only the central VM's public address, since the stations never contact the database. Deploying the two machines to separate virtual networks is equally valid and closer to the lab's wording about remote connection; that arrangement requires an inbound rule for TCP 9092 on the central VM whose source is the stations VM's address specifically, never Any.</w:t>
-      </w:r>
-    </w:p>
-    <w:p>
-      <w:pPr>
-        <w:pStyle w:val="Heading2"/>
-        <w:spacing w:after="120" w:before="240"/>
-      </w:pPr>
-      <w:r>
-        <w:rPr>
-          <w:rFonts w:ascii="Calibri" w:cs="Calibri" w:eastAsia="Calibri" w:hAnsi="Calibri"/>
-          <w:b/>
-          <w:bCs/>
-          <w:color w:val="000000"/>
-        </w:rPr>
-        <w:t xml:space="preserve">9.4 Kafka listener configuration</w:t>
-      </w:r>
-    </w:p>
-    <w:p>
-      <w:pPr>
-        <w:spacing w:after="160" w:line="276"/>
-      </w:pPr>
-      <w:r>
-        <w:rPr>
-          <w:rFonts w:ascii="Calibri" w:cs="Calibri" w:eastAsia="Calibri" w:hAnsi="Calibri"/>
-          <w:color w:val="000000"/>
-        </w:rPr>
-        <w:t xml:space="preserve">The broker advertises two listeners rather than one. Containers on the central VM bootstrap over INTERNAL://kafka:9093 and stay on the Compose network; the remote stations bootstrap over EXTERNAL://&lt;central-host&gt;:9092, which is the only listener published to the host. A single listener advertising the public address would force the local containers to connect out to the VM's own public IP, which the cloud provider does not route back to the instance, and the central station would hang instead of consuming.</w:t>
-      </w:r>
-    </w:p>
-    <w:p>
-      <w:pPr>
-        <w:pStyle w:val="Heading2"/>
-        <w:spacing w:after="120" w:before="240"/>
-      </w:pPr>
-      <w:r>
-        <w:rPr>
-          <w:rFonts w:ascii="Calibri" w:cs="Calibri" w:eastAsia="Calibri" w:hAnsi="Calibri"/>
-          <w:b/>
-          <w:bCs/>
-          <w:color w:val="000000"/>
-        </w:rPr>
-        <w:t xml:space="preserve">9.5 Secret handling</w:t>
-      </w:r>
-    </w:p>
-    <w:p>
-      <w:pPr>
-        <w:spacing w:after="160" w:line="276"/>
-      </w:pPr>
-      <w:r>
-        <w:rPr>
-          <w:rFonts w:ascii="Calibri" w:cs="Calibri" w:eastAsia="Calibri" w:hAnsi="Calibri"/>
-          <w:color w:val="000000"/>
-        </w:rPr>
-        <w:t xml:space="preserve">No credential appears in source control. The database URL, user and password, and the central VM's public address, are read from cloud/.env, which is gitignored; cloud/.env.example documents the required keys with empty values. Both Compose stacks fail immediately with a named error if a required variable is unset, rather than starting with an empty bootstrap address or an empty password.</w:t>
-      </w:r>
-    </w:p>
-    <w:p>
-      <w:pPr>
-        <w:pStyle w:val="Heading2"/>
-        <w:spacing w:after="120" w:before="240"/>
-      </w:pPr>
-      <w:r>
-        <w:rPr>
-          <w:rFonts w:ascii="Calibri" w:cs="Calibri" w:eastAsia="Calibri" w:hAnsi="Calibri"/>
-          <w:b/>
-          <w:bCs/>
-          <w:color w:val="000000"/>
-        </w:rPr>
-        <w:t xml:space="preserve">9.6 Deployment steps</w:t>
-      </w:r>
-    </w:p>
-    <w:p>
-      <w:pPr>
-        <w:pBdr>
-          <w:top w:val="single" w:color="999999" w:sz="4"/>
-          <w:left w:val="single" w:color="999999" w:sz="4"/>
-          <w:bottom w:val="single" w:color="999999" w:sz="4"/>
-          <w:right w:val="single" w:color="999999" w:sz="4"/>
-        </w:pBdr>
-        <w:shd w:fill="F2F2F2" w:val="clear"/>
-        <w:spacing w:after="200" w:before="100"/>
-      </w:pPr>
-      <w:r>
-        <w:rPr>
-          <w:rFonts w:ascii="Consolas" w:cs="Consolas" w:eastAsia="Consolas" w:hAnsi="Consolas"/>
-          <w:color w:val="000000"/>
-          <w:sz w:val="18"/>
-          <w:szCs w:val="18"/>
-        </w:rPr>
-        <w:t xml:space="preserve"># on both VMs (default admin user is azureuser)</w:t>
-      </w:r>
-      <w:r>
-        <w:br/>
-        <w:t xml:space="preserve"/>
-      </w:r>
-      <w:r>
-        <w:rPr>
-          <w:rFonts w:ascii="Consolas" w:cs="Consolas" w:eastAsia="Consolas" w:hAnsi="Consolas"/>
-          <w:color w:val="000000"/>
-          <w:sz w:val="18"/>
-          <w:szCs w:val="18"/>
-        </w:rPr>
-        <w:t xml:space="preserve">sudo apt-get update</w:t>
-      </w:r>
-      <w:r>
-        <w:br/>
-        <w:t xml:space="preserve"/>
-      </w:r>
-      <w:r>
-        <w:rPr>
-          <w:rFonts w:ascii="Consolas" w:cs="Consolas" w:eastAsia="Consolas" w:hAnsi="Consolas"/>
-          <w:color w:val="000000"/>
-          <w:sz w:val="18"/>
-          <w:szCs w:val="18"/>
-        </w:rPr>
-        <w:t xml:space="preserve">sudo apt-get install -y docker.io docker-compose-v2 git</w:t>
-      </w:r>
-      <w:r>
-        <w:br/>
-        <w:t xml:space="preserve"/>
-      </w:r>
-      <w:r>
-        <w:rPr>
-          <w:rFonts w:ascii="Consolas" w:cs="Consolas" w:eastAsia="Consolas" w:hAnsi="Consolas"/>
-          <w:color w:val="000000"/>
-          <w:sz w:val="18"/>
-          <w:szCs w:val="18"/>
-        </w:rPr>
-        <w:t xml:space="preserve">sudo usermod -aG docker $USER &amp;&amp; newgrp docker</w:t>
-      </w:r>
-      <w:r>
-        <w:br/>
-        <w:t xml:space="preserve"/>
-      </w:r>
-      <w:r>
-        <w:rPr>
-          <w:rFonts w:ascii="Consolas" w:cs="Consolas" w:eastAsia="Consolas" w:hAnsi="Consolas"/>
-          <w:color w:val="000000"/>
-          <w:sz w:val="18"/>
-          <w:szCs w:val="18"/>
-        </w:rPr>
-        <w:t xml:space="preserve">git clone &lt;repository-url&gt; &amp;&amp; cd Weather-Stations-Monitoring</w:t>
-      </w:r>
-      <w:r>
-        <w:br/>
-        <w:t xml:space="preserve"/>
-      </w:r>
-      <w:r>
-        <w:rPr>
-          <w:rFonts w:ascii="Consolas" w:cs="Consolas" w:eastAsia="Consolas" w:hAnsi="Consolas"/>
-          <w:color w:val="000000"/>
-          <w:sz w:val="18"/>
-          <w:szCs w:val="18"/>
-        </w:rPr>
-        <w:t xml:space="preserve">cp cloud/.env.example cloud/.env      # then fill it in</w:t>
-      </w:r>
-      <w:r>
-        <w:br/>
-        <w:t xml:space="preserve"/>
-      </w:r>
-      <w:r>
-        <w:rPr>
-          <w:rFonts w:ascii="Consolas" w:cs="Consolas" w:eastAsia="Consolas" w:hAnsi="Consolas"/>
-          <w:color w:val="000000"/>
-          <w:sz w:val="18"/>
-          <w:szCs w:val="18"/>
-        </w:rPr>
-        <w:t xml:space="preserve"/>
-      </w:r>
-      <w:r>
-        <w:br/>
-        <w:t xml:space="preserve"/>
-      </w:r>
-      <w:r>
-        <w:rPr>
-          <w:rFonts w:ascii="Consolas" w:cs="Consolas" w:eastAsia="Consolas" w:hAnsi="Consolas"/>
-          <w:color w:val="000000"/>
-          <w:sz w:val="18"/>
-          <w:szCs w:val="18"/>
-        </w:rPr>
-        <w:t xml:space="preserve"># central VM first, so the broker is listening before stations start</w:t>
-      </w:r>
-      <w:r>
-        <w:br/>
-        <w:t xml:space="preserve"/>
-      </w:r>
-      <w:r>
-        <w:rPr>
-          <w:rFonts w:ascii="Consolas" w:cs="Consolas" w:eastAsia="Consolas" w:hAnsi="Consolas"/>
-          <w:color w:val="000000"/>
-          <w:sz w:val="18"/>
-          <w:szCs w:val="18"/>
-        </w:rPr>
-        <w:t xml:space="preserve">docker compose -f cloud/docker-compose.central.yml up -d --build</w:t>
-      </w:r>
-      <w:r>
-        <w:br/>
-        <w:t xml:space="preserve"/>
-      </w:r>
-      <w:r>
-        <w:rPr>
-          <w:rFonts w:ascii="Consolas" w:cs="Consolas" w:eastAsia="Consolas" w:hAnsi="Consolas"/>
-          <w:color w:val="000000"/>
-          <w:sz w:val="18"/>
-          <w:szCs w:val="18"/>
-        </w:rPr>
-        <w:t xml:space="preserve"/>
-      </w:r>
-      <w:r>
-        <w:br/>
-        <w:t xml:space="preserve"/>
-      </w:r>
-      <w:r>
-        <w:rPr>
-          <w:rFonts w:ascii="Consolas" w:cs="Consolas" w:eastAsia="Consolas" w:hAnsi="Consolas"/>
-          <w:color w:val="000000"/>
-          <w:sz w:val="18"/>
-          <w:szCs w:val="18"/>
-        </w:rPr>
-        <w:t xml:space="preserve"># then the stations VM</w:t>
-      </w:r>
-      <w:r>
-        <w:br/>
-        <w:t xml:space="preserve"/>
-      </w:r>
-      <w:r>
-        <w:rPr>
-          <w:rFonts w:ascii="Consolas" w:cs="Consolas" w:eastAsia="Consolas" w:hAnsi="Consolas"/>
-          <w:color w:val="000000"/>
-          <w:sz w:val="18"/>
-          <w:szCs w:val="18"/>
-        </w:rPr>
-        <w:t xml:space="preserve">docker compose -f cloud/docker-compose.stations.yml up -d --build</w:t>
-      </w:r>
-    </w:p>
-    <w:p>
-      <w:pPr>
-        <w:spacing w:after="160" w:line="276"/>
-      </w:pPr>
-      <w:r>
-        <w:rPr>
-          <w:rFonts w:ascii="Calibri" w:cs="Calibri" w:eastAsia="Calibri" w:hAnsi="Calibri"/>
-          <w:color w:val="000000"/>
-        </w:rPr>
-        <w:t xml:space="preserve">The full procedure, including the Aiven service setup and a troubleshooting guide for the common connectivity failures, is in cloud/README.md.</w:t>
-      </w:r>
-    </w:p>
-    <w:p>
-      <w:pPr>
-        <w:pStyle w:val="Heading2"/>
-        <w:spacing w:after="120" w:before="240"/>
-      </w:pPr>
-      <w:r>
-        <w:rPr>
-          <w:rFonts w:ascii="Calibri" w:cs="Calibri" w:eastAsia="Calibri" w:hAnsi="Calibri"/>
-          <w:b/>
-          <w:bCs/>
-          <w:color w:val="000000"/>
-        </w:rPr>
-        <w:t xml:space="preserve">9.7 Evidence</w:t>
-      </w:r>
-    </w:p>
-    <w:p>
-      <w:pPr>
-        <w:keepNext/>
-        <w:spacing w:after="60" w:before="280"/>
-      </w:pPr>
-      <w:r>
-        <w:rPr>
-          <w:rFonts w:ascii="Calibri" w:cs="Calibri" w:eastAsia="Calibri" w:hAnsi="Calibri"/>
-          <w:b/>
-          <w:bCs/>
-          <w:color w:val="000000"/>
-          <w:sz w:val="20"/>
-          <w:szCs w:val="20"/>
-        </w:rPr>
-        <w:t xml:space="preserve">Figure 10 — Azure portal showing both virtual machines running, with size and region</w:t>
-      </w:r>
-    </w:p>
-    <w:p>
-      <w:pPr>
-        <w:pBdr>
-          <w:top w:val="dashed" w:color="A6A6A6" w:sz="6"/>
-          <w:left w:val="dashed" w:color="A6A6A6" w:sz="6"/>
-          <w:bottom w:val="dashed" w:color="A6A6A6" w:sz="6"/>
-          <w:right w:val="dashed" w:color="A6A6A6" w:sz="6"/>
-        </w:pBdr>
-        <w:shd w:fill="FAFAFA" w:val="clear"/>
-        <w:spacing w:before="120" w:after="240"/>
-        <w:jc w:val="center"/>
-      </w:pPr>
-      <w:r>
-        <w:rPr>
-          <w:rFonts w:ascii="Calibri" w:cs="Calibri" w:eastAsia="Calibri" w:hAnsi="Calibri"/>
-          <w:i/>
-          <w:iCs/>
-          <w:color w:val="808080"/>
-          <w:sz w:val="20"/>
-          <w:szCs w:val="20"/>
-        </w:rPr>
-        <w:br/>
-        <w:br/>
-        <w:br/>
-        <w:t xml:space="preserve">[ paste screenshot here ]</w:t>
-        <w:br/>
-        <w:br/>
-        <w:br/>
-      </w:r>
-    </w:p>
-    <w:p>
-      <w:pPr>
-        <w:keepNext/>
-        <w:spacing w:after="60" w:before="280"/>
-      </w:pPr>
-      <w:r>
-        <w:rPr>
-          <w:rFonts w:ascii="Calibri" w:cs="Calibri" w:eastAsia="Calibri" w:hAnsi="Calibri"/>
-          <w:b/>
-          <w:bCs/>
-          <w:color w:val="000000"/>
-          <w:sz w:val="20"/>
-          <w:szCs w:val="20"/>
-        </w:rPr>
-        <w:t xml:space="preserve">Figure 11 — Network security group inbound rules for both virtual machines</w:t>
-      </w:r>
-    </w:p>
-    <w:p>
-      <w:pPr>
-        <w:pBdr>
-          <w:top w:val="dashed" w:color="A6A6A6" w:sz="6"/>
-          <w:left w:val="dashed" w:color="A6A6A6" w:sz="6"/>
-          <w:bottom w:val="dashed" w:color="A6A6A6" w:sz="6"/>
-          <w:right w:val="dashed" w:color="A6A6A6" w:sz="6"/>
-        </w:pBdr>
-        <w:shd w:fill="FAFAFA" w:val="clear"/>
-        <w:spacing w:before="120" w:after="240"/>
-        <w:jc w:val="center"/>
-      </w:pPr>
-      <w:r>
-        <w:rPr>
-          <w:rFonts w:ascii="Calibri" w:cs="Calibri" w:eastAsia="Calibri" w:hAnsi="Calibri"/>
-          <w:i/>
-          <w:iCs/>
-          <w:color w:val="808080"/>
-          <w:sz w:val="20"/>
-          <w:szCs w:val="20"/>
-        </w:rPr>
-        <w:br/>
-        <w:br/>
-        <w:br/>
-        <w:t xml:space="preserve">[ paste screenshot here ]</w:t>
-        <w:br/>
-        <w:br/>
-        <w:br/>
-      </w:r>
-    </w:p>
-    <w:p>
-      <w:pPr>
-        <w:keepNext/>
-        <w:spacing w:after="60" w:before="280"/>
-      </w:pPr>
-      <w:r>
-        <w:rPr>
-          <w:rFonts w:ascii="Calibri" w:cs="Calibri" w:eastAsia="Calibri" w:hAnsi="Calibri"/>
-          <w:b/>
-          <w:bCs/>
-          <w:color w:val="000000"/>
-          <w:sz w:val="20"/>
-          <w:szCs w:val="20"/>
-        </w:rPr>
-        <w:t xml:space="preserve">Figure 12 — Aiven service overview, showing plan, region and Running status</w:t>
-      </w:r>
-    </w:p>
-    <w:p>
-      <w:pPr>
-        <w:pBdr>
-          <w:top w:val="dashed" w:color="A6A6A6" w:sz="6"/>
-          <w:left w:val="dashed" w:color="A6A6A6" w:sz="6"/>
-          <w:bottom w:val="dashed" w:color="A6A6A6" w:sz="6"/>
-          <w:right w:val="dashed" w:color="A6A6A6" w:sz="6"/>
-        </w:pBdr>
-        <w:shd w:fill="FAFAFA" w:val="clear"/>
-        <w:spacing w:before="120" w:after="240"/>
-        <w:jc w:val="center"/>
-      </w:pPr>
-      <w:r>
-        <w:rPr>
-          <w:rFonts w:ascii="Calibri" w:cs="Calibri" w:eastAsia="Calibri" w:hAnsi="Calibri"/>
-          <w:i/>
-          <w:iCs/>
-          <w:color w:val="808080"/>
-          <w:sz w:val="20"/>
-          <w:szCs w:val="20"/>
-        </w:rPr>
-        <w:br/>
-        <w:br/>
-        <w:br/>
-        <w:t xml:space="preserve">[ paste screenshot here ]</w:t>
-        <w:br/>
-        <w:br/>
-        <w:br/>
-      </w:r>
-    </w:p>
-    <w:p>
-      <w:pPr>
-        <w:keepNext/>
-        <w:spacing w:after="60" w:before="280"/>
-      </w:pPr>
-      <w:r>
-        <w:rPr>
-          <w:rFonts w:ascii="Calibri" w:cs="Calibri" w:eastAsia="Calibri" w:hAnsi="Calibri"/>
-          <w:b/>
-          <w:bCs/>
-          <w:color w:val="000000"/>
-          <w:sz w:val="20"/>
-          <w:szCs w:val="20"/>
-        </w:rPr>
-        <w:t xml:space="preserve">Figure 13 — Aiven allowed IP addresses, listing only the central VM</w:t>
-      </w:r>
-    </w:p>
-    <w:p>
-      <w:pPr>
-        <w:pBdr>
-          <w:top w:val="dashed" w:color="A6A6A6" w:sz="6"/>
-          <w:left w:val="dashed" w:color="A6A6A6" w:sz="6"/>
-          <w:bottom w:val="dashed" w:color="A6A6A6" w:sz="6"/>
-          <w:right w:val="dashed" w:color="A6A6A6" w:sz="6"/>
-        </w:pBdr>
-        <w:shd w:fill="FAFAFA" w:val="clear"/>
-        <w:spacing w:before="120" w:after="240"/>
-        <w:jc w:val="center"/>
-      </w:pPr>
-      <w:r>
-        <w:rPr>
-          <w:rFonts w:ascii="Calibri" w:cs="Calibri" w:eastAsia="Calibri" w:hAnsi="Calibri"/>
-          <w:i/>
-          <w:iCs/>
-          <w:color w:val="808080"/>
-          <w:sz w:val="20"/>
-          <w:szCs w:val="20"/>
-        </w:rPr>
-        <w:br/>
-        <w:br/>
-        <w:br/>
-        <w:t xml:space="preserve">[ paste screenshot here ]</w:t>
-        <w:br/>
-        <w:br/>
-        <w:br/>
-      </w:r>
-    </w:p>
-    <w:p>
-      <w:pPr>
-        <w:keepNext/>
-        <w:spacing w:after="60" w:before="280"/>
-      </w:pPr>
-      <w:r>
-        <w:rPr>
-          <w:rFonts w:ascii="Calibri" w:cs="Calibri" w:eastAsia="Calibri" w:hAnsi="Calibri"/>
-          <w:b/>
-          <w:bCs/>
-          <w:color w:val="000000"/>
-          <w:sz w:val="20"/>
-          <w:szCs w:val="20"/>
-        </w:rPr>
-        <w:t xml:space="preserve">Figure 14 — docker compose ps on the Weather Stations VM, showing all ten station containers up</w:t>
-      </w:r>
-    </w:p>
-    <w:p>
-      <w:pPr>
-        <w:pBdr>
-          <w:top w:val="dashed" w:color="A6A6A6" w:sz="6"/>
-          <w:left w:val="dashed" w:color="A6A6A6" w:sz="6"/>
-          <w:bottom w:val="dashed" w:color="A6A6A6" w:sz="6"/>
-          <w:right w:val="dashed" w:color="A6A6A6" w:sz="6"/>
-        </w:pBdr>
-        <w:shd w:fill="FAFAFA" w:val="clear"/>
-        <w:spacing w:before="120" w:after="240"/>
-        <w:jc w:val="center"/>
-      </w:pPr>
-      <w:r>
-        <w:rPr>
-          <w:rFonts w:ascii="Calibri" w:cs="Calibri" w:eastAsia="Calibri" w:hAnsi="Calibri"/>
-          <w:i/>
-          <w:iCs/>
-          <w:color w:val="808080"/>
-          <w:sz w:val="20"/>
-          <w:szCs w:val="20"/>
-        </w:rPr>
-        <w:br/>
-        <w:br/>
-        <w:br/>
-        <w:t xml:space="preserve">[ paste screenshot here ]</w:t>
-        <w:br/>
-        <w:br/>
-        <w:br/>
-      </w:r>
-    </w:p>
-    <w:p>
-      <w:pPr>
-        <w:keepNext/>
-        <w:spacing w:after="60" w:before="280"/>
-      </w:pPr>
-      <w:r>
-        <w:rPr>
-          <w:rFonts w:ascii="Calibri" w:cs="Calibri" w:eastAsia="Calibri" w:hAnsi="Calibri"/>
-          <w:b/>
-          <w:bCs/>
-          <w:color w:val="000000"/>
-          <w:sz w:val="20"/>
-          <w:szCs w:val="20"/>
-        </w:rPr>
-        <w:t xml:space="preserve">Figure 15 — docker compose ps on the Central Base Station VM</w:t>
-      </w:r>
-    </w:p>
-    <w:p>
-      <w:pPr>
-        <w:pBdr>
-          <w:top w:val="dashed" w:color="A6A6A6" w:sz="6"/>
-          <w:left w:val="dashed" w:color="A6A6A6" w:sz="6"/>
-          <w:bottom w:val="dashed" w:color="A6A6A6" w:sz="6"/>
-          <w:right w:val="dashed" w:color="A6A6A6" w:sz="6"/>
-        </w:pBdr>
-        <w:shd w:fill="FAFAFA" w:val="clear"/>
-        <w:spacing w:before="120" w:after="240"/>
-        <w:jc w:val="center"/>
-      </w:pPr>
-      <w:r>
-        <w:rPr>
-          <w:rFonts w:ascii="Calibri" w:cs="Calibri" w:eastAsia="Calibri" w:hAnsi="Calibri"/>
-          <w:i/>
-          <w:iCs/>
-          <w:color w:val="808080"/>
-          <w:sz w:val="20"/>
-          <w:szCs w:val="20"/>
-        </w:rPr>
-        <w:br/>
-        <w:br/>
-        <w:br/>
-        <w:t xml:space="preserve">[ paste screenshot here ]</w:t>
-        <w:br/>
-        <w:br/>
-        <w:br/>
-      </w:r>
-    </w:p>
-    <w:p>
-      <w:pPr>
-        <w:keepNext/>
-        <w:spacing w:after="60" w:before="280"/>
-      </w:pPr>
-      <w:r>
-        <w:rPr>
-          <w:rFonts w:ascii="Calibri" w:cs="Calibri" w:eastAsia="Calibri" w:hAnsi="Calibri"/>
-          <w:b/>
-          <w:bCs/>
-          <w:color w:val="000000"/>
-          <w:sz w:val="20"/>
-          <w:szCs w:val="20"/>
-        </w:rPr>
-        <w:t xml:space="preserve">Figure 16 — Station container logs on the stations VM, showing sends and drops</w:t>
-      </w:r>
-    </w:p>
-    <w:p>
-      <w:pPr>
-        <w:pBdr>
-          <w:top w:val="dashed" w:color="A6A6A6" w:sz="6"/>
-          <w:left w:val="dashed" w:color="A6A6A6" w:sz="6"/>
-          <w:bottom w:val="dashed" w:color="A6A6A6" w:sz="6"/>
-          <w:right w:val="dashed" w:color="A6A6A6" w:sz="6"/>
-        </w:pBdr>
-        <w:shd w:fill="FAFAFA" w:val="clear"/>
-        <w:spacing w:before="120" w:after="240"/>
-        <w:jc w:val="center"/>
-      </w:pPr>
-      <w:r>
-        <w:rPr>
-          <w:rFonts w:ascii="Calibri" w:cs="Calibri" w:eastAsia="Calibri" w:hAnsi="Calibri"/>
-          <w:i/>
-          <w:iCs/>
-          <w:color w:val="808080"/>
-          <w:sz w:val="20"/>
-          <w:szCs w:val="20"/>
-        </w:rPr>
-        <w:br/>
-        <w:br/>
-        <w:br/>
-        <w:t xml:space="preserve">[ paste screenshot here ]</w:t>
-        <w:br/>
-        <w:br/>
-        <w:br/>
-      </w:r>
-    </w:p>
-    <w:p>
-      <w:pPr>
-        <w:keepNext/>
-        <w:spacing w:after="60" w:before="280"/>
-      </w:pPr>
-      <w:r>
-        <w:rPr>
-          <w:rFonts w:ascii="Calibri" w:cs="Calibri" w:eastAsia="Calibri" w:hAnsi="Calibri"/>
-          <w:b/>
-          <w:bCs/>
-          <w:color w:val="000000"/>
-          <w:sz w:val="20"/>
-          <w:szCs w:val="20"/>
-        </w:rPr>
-        <w:t xml:space="preserve">Figure 17 — Central Station logs showing 'Persisted batch of N readings' — proof of connectivity to the managed database</w:t>
-      </w:r>
-    </w:p>
-    <w:p>
-      <w:pPr>
-        <w:pBdr>
-          <w:top w:val="dashed" w:color="A6A6A6" w:sz="6"/>
-          <w:left w:val="dashed" w:color="A6A6A6" w:sz="6"/>
-          <w:bottom w:val="dashed" w:color="A6A6A6" w:sz="6"/>
-          <w:right w:val="dashed" w:color="A6A6A6" w:sz="6"/>
-        </w:pBdr>
-        <w:shd w:fill="FAFAFA" w:val="clear"/>
-        <w:spacing w:before="120" w:after="240"/>
-        <w:jc w:val="center"/>
-      </w:pPr>
-      <w:r>
-        <w:rPr>
-          <w:rFonts w:ascii="Calibri" w:cs="Calibri" w:eastAsia="Calibri" w:hAnsi="Calibri"/>
-          <w:i/>
-          <w:iCs/>
-          <w:color w:val="808080"/>
-          <w:sz w:val="20"/>
-          <w:szCs w:val="20"/>
-        </w:rPr>
-        <w:br/>
-        <w:br/>
-        <w:br/>
-        <w:t xml:space="preserve">[ paste screenshot here ]</w:t>
-        <w:br/>
-        <w:br/>
-        <w:br/>
-      </w:r>
-    </w:p>
-    <w:p>
-      <w:pPr>
-        <w:keepNext/>
-        <w:spacing w:after="60" w:before="280"/>
-      </w:pPr>
-      <w:r>
-        <w:rPr>
-          <w:rFonts w:ascii="Calibri" w:cs="Calibri" w:eastAsia="Calibri" w:hAnsi="Calibri"/>
-          <w:b/>
-          <w:bCs/>
-          <w:color w:val="000000"/>
-          <w:sz w:val="20"/>
-          <w:szCs w:val="20"/>
-        </w:rPr>
-        <w:t xml:space="preserve">Figure 18 — Part E analysis queries run against the Aiven database</w:t>
-      </w:r>
-    </w:p>
-    <w:p>
-      <w:pPr>
-        <w:pBdr>
-          <w:top w:val="dashed" w:color="A6A6A6" w:sz="6"/>
-          <w:left w:val="dashed" w:color="A6A6A6" w:sz="6"/>
-          <w:bottom w:val="dashed" w:color="A6A6A6" w:sz="6"/>
-          <w:right w:val="dashed" w:color="A6A6A6" w:sz="6"/>
-        </w:pBdr>
-        <w:shd w:fill="FAFAFA" w:val="clear"/>
-        <w:spacing w:before="120" w:after="240"/>
-        <w:jc w:val="center"/>
-      </w:pPr>
-      <w:r>
-        <w:rPr>
-          <w:rFonts w:ascii="Calibri" w:cs="Calibri" w:eastAsia="Calibri" w:hAnsi="Calibri"/>
-          <w:i/>
-          <w:iCs/>
-          <w:color w:val="808080"/>
-          <w:sz w:val="20"/>
-          <w:szCs w:val="20"/>
-        </w:rPr>
-        <w:br/>
-        <w:br/>
-        <w:br/>
-        <w:t xml:space="preserve">[ paste screenshot here ]</w:t>
-        <w:br/>
-        <w:br/>
-        <w:br/>
-      </w:r>
-    </w:p>
     <w:sectPr>
       <w:pgSz w:w="12240" w:h="15840" w:orient="portrait"/>
       <w:pgMar w:top="1440" w:right="1440" w:bottom="1440" w:left="1440" w:header="708" w:footer="708" w:gutter="0"/>

</xml_diff>